<commit_message>
Kim12-1-7-Madde-Elektrik-Iliskisi: gorsel alanlarina Shutter onizlemeleri yerlestirildi (2.3 bicimi)
</commit_message>
<xml_diff>
--- a/Kim12-1-7-Madde-Elektrik-Iliskisi.docx
+++ b/Kim12-1-7-Madde-Elektrik-Iliskisi.docx
@@ -39,99 +39,73 @@
         <w:t xml:space="preserve">2020 Tokyo Olimpiyat Oyunları’nda Türk sporcular 2 altın, 2 gümüş ve 9 bronz olmak üzere 13 madalya kazandı (Görsel A). Peki bu madalyaların yapıldığı metallerin nasıl elde edildiğini biliyor musunuz? Bu oyunlarda dağıtılan madalyaların metalleri, halkın bağışladığı eski cep telefonları ve küçük elektronik cihazlardan geri kazanılmıştır (Görsel B). Elektronik atıklardan ayrılan bakır, gümüş ve altın gibi metallerin saflaştırılmasında elektroliz yöntemlerinden yararlanılır. Bir elektroliz tesisinde belirli bir miktarda metal elde etmek için ne kadar süre çalışılması gerektiği nasıl belirlenir? Elektrotlarda oluşan madde miktarı devreden geçen akıma ve elektroliz süresine nasıl bağlıdır?</w:t>
       </w:r>
     </w:p>
-    <w:tbl>
-      <w:tblPr>
-        <w:tblW w:w="9000" w:type="dxa"/>
+    <w:p>
+      <w:pPr>
         <w:jc w:val="center"/>
-        <w:tblBorders>
-          <w:top w:val="single" w:sz="8" w:space="0" w:color="7F7F7F"/>
-          <w:left w:val="single" w:sz="8" w:space="0" w:color="7F7F7F"/>
-          <w:bottom w:val="single" w:sz="8" w:space="0" w:color="7F7F7F"/>
-          <w:right w:val="single" w:sz="8" w:space="0" w:color="7F7F7F"/>
-        </w:tblBorders>
-      </w:tblPr>
-      <w:tblGrid>
-        <w:gridCol w:w="9000"/>
-      </w:tblGrid>
-      <w:tr>
-        <w:tc>
-          <w:tcPr>
-            <w:tcW w:w="9000" w:type="dxa"/>
-            <w:shd w:val="clear" w:color="auto" w:fill="EDEDED"/>
-          </w:tcPr>
-          <w:p>
-            <w:pPr>
-              <w:jc w:val="both"/>
-              <w:rPr>
-                <w:rFonts w:ascii="Times New Roman" w:hAnsi="Times New Roman" w:cs="Times New Roman"/>
-                <w:lang w:val="tr-TR"/>
-              </w:rPr>
-            </w:pPr>
-            <w:r>
-              <w:rPr>
-                <w:rFonts w:ascii="Times New Roman" w:hAnsi="Times New Roman" w:cs="Times New Roman"/>
-                <w:lang w:val="tr-TR"/>
-              </w:rPr>
-              <w:t xml:space="preserve">GÖRSEL ALANI (Shutterstock)</w:t>
-            </w:r>
-          </w:p>
-          <w:p>
-            <w:pPr>
-              <w:jc w:val="both"/>
-              <w:rPr>
-                <w:rFonts w:ascii="Times New Roman" w:hAnsi="Times New Roman" w:cs="Times New Roman"/>
-                <w:lang w:val="tr-TR"/>
-              </w:rPr>
-            </w:pPr>
-            <w:r>
-              <w:rPr>
-                <w:rFonts w:ascii="Times New Roman" w:hAnsi="Times New Roman" w:cs="Times New Roman"/>
-                <w:lang w:val="tr-TR"/>
-              </w:rPr>
-              <w:t xml:space="preserve">Tarif: Kurdeleleriyle birlikte yan yana duran altın, gümüş ve bronz renkli üç madalya; olimpiyat halkaları, organizasyon logosu ya da yazı görünmesin.</w:t>
-            </w:r>
-          </w:p>
-          <w:p>
-            <w:pPr>
-              <w:jc w:val="both"/>
-              <w:rPr>
-                <w:rFonts w:ascii="Times New Roman" w:hAnsi="Times New Roman" w:cs="Times New Roman"/>
-                <w:lang w:val="tr-TR"/>
-              </w:rPr>
-            </w:pPr>
-            <w:r>
-              <w:rPr>
-                <w:rFonts w:ascii="Times New Roman" w:hAnsi="Times New Roman" w:cs="Times New Roman"/>
-                <w:lang w:val="tr-TR"/>
-              </w:rPr>
-              <w:t xml:space="preserve">Shutter ID: 2681962101 (fotoğraf) — Gold, silver and bronze medals with ribbon</w:t>
-            </w:r>
-          </w:p>
-        </w:tc>
-      </w:tr>
-    </w:tbl>
-    <w:p>
-      <w:pPr>
-        <w:jc w:val="both"/>
-        <w:rPr>
-          <w:rFonts w:ascii="Times New Roman" w:hAnsi="Times New Roman" w:cs="Times New Roman"/>
-          <w:lang w:val="tr-TR"/>
-        </w:rPr>
-      </w:pPr>
+      </w:pPr>
+      <w:r>
+        <w:drawing>
+          <wp:inline xmlns:a="http://schemas.openxmlformats.org/drawingml/2006/main" xmlns:pic="http://schemas.openxmlformats.org/drawingml/2006/picture">
+            <wp:extent cx="4766708" cy="2520000"/>
+            <wp:docPr id="900016" name="Picture 900016"/>
+            <wp:cNvGraphicFramePr>
+              <a:graphicFrameLocks noChangeAspect="1"/>
+            </wp:cNvGraphicFramePr>
+            <a:graphic>
+              <a:graphicData uri="http://schemas.openxmlformats.org/drawingml/2006/picture">
+                <pic:pic>
+                  <pic:nvPicPr>
+                    <pic:cNvPr id="0" name="2681962101_d.jpg"/>
+                    <pic:cNvPicPr/>
+                  </pic:nvPicPr>
+                  <pic:blipFill>
+                    <a:blip r:embed="rId11"/>
+                    <a:stretch>
+                      <a:fillRect/>
+                    </a:stretch>
+                  </pic:blipFill>
+                  <pic:spPr>
+                    <a:xfrm>
+                      <a:off x="0" y="0"/>
+                      <a:ext cx="4766708" cy="2520000"/>
+                    </a:xfrm>
+                    <a:prstGeom prst="rect"/>
+                  </pic:spPr>
+                </pic:pic>
+              </a:graphicData>
+            </a:graphic>
+          </wp:inline>
+        </w:drawing>
+      </w:r>
     </w:p>
     <w:p>
       <w:pPr>
         <w:jc w:val="center"/>
-        <w:rPr>
-          <w:rFonts w:ascii="Times New Roman" w:hAnsi="Times New Roman" w:cs="Times New Roman"/>
-          <w:lang w:val="tr-TR"/>
-        </w:rPr>
       </w:pPr>
       <w:r>
         <w:rPr>
           <w:rFonts w:ascii="Times New Roman" w:hAnsi="Times New Roman" w:cs="Times New Roman"/>
           <w:b/>
           <w:bCs/>
+          <w:highlight w:val="yellow"/>
+          <w:lang w:val="tr-TR"/>
+        </w:rPr>
+        <w:t xml:space="preserve">Shutter id: 2681962101</w:t>
+      </w:r>
+    </w:p>
+    <w:p>
+      <w:pPr>
+        <w:jc w:val="center"/>
+        <w:rPr>
+          <w:rFonts w:ascii="Times New Roman" w:hAnsi="Times New Roman" w:cs="Times New Roman"/>
+          <w:lang w:val="tr-TR"/>
+        </w:rPr>
+      </w:pPr>
+      <w:r>
+        <w:rPr>
+          <w:rFonts w:ascii="Times New Roman" w:hAnsi="Times New Roman" w:cs="Times New Roman"/>
+          <w:b/>
+          <w:bCs/>
           <w:lang w:val="tr-TR"/>
         </w:rPr>
         <w:t xml:space="preserve">Görsel A:</w:t>
@@ -144,85 +118,59 @@
         <w:t xml:space="preserve"> Altın, gümüş ve bronz madalyalar</w:t>
       </w:r>
     </w:p>
-    <w:tbl>
-      <w:tblPr>
-        <w:tblW w:w="9000" w:type="dxa"/>
+    <w:p>
+      <w:pPr>
         <w:jc w:val="center"/>
-        <w:tblBorders>
-          <w:top w:val="single" w:sz="8" w:space="0" w:color="7F7F7F"/>
-          <w:left w:val="single" w:sz="8" w:space="0" w:color="7F7F7F"/>
-          <w:bottom w:val="single" w:sz="8" w:space="0" w:color="7F7F7F"/>
-          <w:right w:val="single" w:sz="8" w:space="0" w:color="7F7F7F"/>
-        </w:tblBorders>
-      </w:tblPr>
-      <w:tblGrid>
-        <w:gridCol w:w="9000"/>
-      </w:tblGrid>
-      <w:tr>
-        <w:tc>
-          <w:tcPr>
-            <w:tcW w:w="9000" w:type="dxa"/>
-            <w:shd w:val="clear" w:color="auto" w:fill="EDEDED"/>
-          </w:tcPr>
-          <w:p>
-            <w:pPr>
-              <w:jc w:val="both"/>
-              <w:rPr>
-                <w:rFonts w:ascii="Times New Roman" w:hAnsi="Times New Roman" w:cs="Times New Roman"/>
-                <w:lang w:val="tr-TR"/>
-              </w:rPr>
-            </w:pPr>
-            <w:r>
-              <w:rPr>
-                <w:rFonts w:ascii="Times New Roman" w:hAnsi="Times New Roman" w:cs="Times New Roman"/>
-                <w:lang w:val="tr-TR"/>
-              </w:rPr>
-              <w:t xml:space="preserve">GÖRSEL ALANI (Shutterstock)</w:t>
-            </w:r>
-          </w:p>
-          <w:p>
-            <w:pPr>
-              <w:jc w:val="both"/>
-              <w:rPr>
-                <w:rFonts w:ascii="Times New Roman" w:hAnsi="Times New Roman" w:cs="Times New Roman"/>
-                <w:lang w:val="tr-TR"/>
-              </w:rPr>
-            </w:pPr>
-            <w:r>
-              <w:rPr>
-                <w:rFonts w:ascii="Times New Roman" w:hAnsi="Times New Roman" w:cs="Times New Roman"/>
-                <w:lang w:val="tr-TR"/>
-              </w:rPr>
-              <w:t xml:space="preserve">Tarif: Ayrıştırılmayı bekleyen eski cep telefonu devre kartları ve elektronik parçalar; marka ve logo görünmesin.</w:t>
-            </w:r>
-          </w:p>
-          <w:p>
-            <w:pPr>
-              <w:jc w:val="both"/>
-              <w:rPr>
-                <w:rFonts w:ascii="Times New Roman" w:hAnsi="Times New Roman" w:cs="Times New Roman"/>
-                <w:lang w:val="tr-TR"/>
-              </w:rPr>
-            </w:pPr>
-            <w:r>
-              <w:rPr>
-                <w:rFonts w:ascii="Times New Roman" w:hAnsi="Times New Roman" w:cs="Times New Roman"/>
-                <w:lang w:val="tr-TR"/>
-              </w:rPr>
-              <w:t xml:space="preserve">Shutter ID: 2505052055 (fotoğraf) — Pile of electronic waste on factory floor</w:t>
-            </w:r>
-          </w:p>
-        </w:tc>
-      </w:tr>
-    </w:tbl>
+      </w:pPr>
+      <w:r>
+        <w:drawing>
+          <wp:inline xmlns:a="http://schemas.openxmlformats.org/drawingml/2006/main" xmlns:pic="http://schemas.openxmlformats.org/drawingml/2006/picture">
+            <wp:extent cx="3436363" cy="2520000"/>
+            <wp:docPr id="900017" name="Picture 900017"/>
+            <wp:cNvGraphicFramePr>
+              <a:graphicFrameLocks noChangeAspect="1"/>
+            </wp:cNvGraphicFramePr>
+            <a:graphic>
+              <a:graphicData uri="http://schemas.openxmlformats.org/drawingml/2006/picture">
+                <pic:pic>
+                  <pic:nvPicPr>
+                    <pic:cNvPr id="0" name="2505052055_d.jpg"/>
+                    <pic:cNvPicPr/>
+                  </pic:nvPicPr>
+                  <pic:blipFill>
+                    <a:blip r:embed="rId12"/>
+                    <a:stretch>
+                      <a:fillRect/>
+                    </a:stretch>
+                  </pic:blipFill>
+                  <pic:spPr>
+                    <a:xfrm>
+                      <a:off x="0" y="0"/>
+                      <a:ext cx="3436363" cy="2520000"/>
+                    </a:xfrm>
+                    <a:prstGeom prst="rect"/>
+                  </pic:spPr>
+                </pic:pic>
+              </a:graphicData>
+            </a:graphic>
+          </wp:inline>
+        </w:drawing>
+      </w:r>
+    </w:p>
     <w:p>
       <w:pPr>
-        <w:jc w:val="both"/>
-        <w:rPr>
-          <w:rFonts w:ascii="Times New Roman" w:hAnsi="Times New Roman" w:cs="Times New Roman"/>
-          <w:lang w:val="tr-TR"/>
-        </w:rPr>
-      </w:pPr>
+        <w:jc w:val="center"/>
+      </w:pPr>
+      <w:r>
+        <w:rPr>
+          <w:rFonts w:ascii="Times New Roman" w:hAnsi="Times New Roman" w:cs="Times New Roman"/>
+          <w:b/>
+          <w:bCs/>
+          <w:highlight w:val="yellow"/>
+          <w:lang w:val="tr-TR"/>
+        </w:rPr>
+        <w:t xml:space="preserve">Shutter id: 2505052055</w:t>
+      </w:r>
     </w:p>
     <w:p>
       <w:pPr>

</xml_diff>